<commit_message>
python mundo 2 update
</commit_message>
<xml_diff>
--- a/Mundo_02/curso_python_Mundo2.docx
+++ b/Mundo_02/curso_python_Mundo2.docx
@@ -33,7 +33,79 @@
           <w:sz w:val="56"/>
           <w:szCs w:val="56"/>
         </w:rPr>
-        <w:t xml:space="preserve"> e vai falar sobre Estruturas de Controle da linguagem: if.. elif.. else, for e while.</w:t>
+        <w:t xml:space="preserve"> e vai falar sobre Estruturas de Controle da linguagem: </w:t>
+      </w:r>
+      <w:proofErr w:type="spellStart"/>
+      <w:r>
+        <w:rPr>
+          <w:rFonts w:ascii="Arial" w:hAnsi="Arial" w:cs="Arial"/>
+          <w:sz w:val="56"/>
+          <w:szCs w:val="56"/>
+        </w:rPr>
+        <w:t>if</w:t>
+      </w:r>
+      <w:proofErr w:type="spellEnd"/>
+      <w:r>
+        <w:rPr>
+          <w:rFonts w:ascii="Arial" w:hAnsi="Arial" w:cs="Arial"/>
+          <w:sz w:val="56"/>
+          <w:szCs w:val="56"/>
+        </w:rPr>
+        <w:t xml:space="preserve">.. </w:t>
+      </w:r>
+      <w:proofErr w:type="spellStart"/>
+      <w:r>
+        <w:rPr>
+          <w:rFonts w:ascii="Arial" w:hAnsi="Arial" w:cs="Arial"/>
+          <w:sz w:val="56"/>
+          <w:szCs w:val="56"/>
+        </w:rPr>
+        <w:t>elif</w:t>
+      </w:r>
+      <w:proofErr w:type="spellEnd"/>
+      <w:r>
+        <w:rPr>
+          <w:rFonts w:ascii="Arial" w:hAnsi="Arial" w:cs="Arial"/>
+          <w:sz w:val="56"/>
+          <w:szCs w:val="56"/>
+        </w:rPr>
+        <w:t xml:space="preserve">.. </w:t>
+      </w:r>
+      <w:proofErr w:type="spellStart"/>
+      <w:r>
+        <w:rPr>
+          <w:rFonts w:ascii="Arial" w:hAnsi="Arial" w:cs="Arial"/>
+          <w:sz w:val="56"/>
+          <w:szCs w:val="56"/>
+        </w:rPr>
+        <w:t>else</w:t>
+      </w:r>
+      <w:proofErr w:type="spellEnd"/>
+      <w:r>
+        <w:rPr>
+          <w:rFonts w:ascii="Arial" w:hAnsi="Arial" w:cs="Arial"/>
+          <w:sz w:val="56"/>
+          <w:szCs w:val="56"/>
+        </w:rPr>
+        <w:t xml:space="preserve">, for e </w:t>
+      </w:r>
+      <w:proofErr w:type="spellStart"/>
+      <w:r>
+        <w:rPr>
+          <w:rFonts w:ascii="Arial" w:hAnsi="Arial" w:cs="Arial"/>
+          <w:sz w:val="56"/>
+          <w:szCs w:val="56"/>
+        </w:rPr>
+        <w:t>while</w:t>
+      </w:r>
+      <w:proofErr w:type="spellEnd"/>
+      <w:r>
+        <w:rPr>
+          <w:rFonts w:ascii="Arial" w:hAnsi="Arial" w:cs="Arial"/>
+          <w:sz w:val="56"/>
+          <w:szCs w:val="56"/>
+        </w:rPr>
+        <w:t>.</w:t>
       </w:r>
     </w:p>
     <w:p>
@@ -77,7 +149,61 @@
           <w:sz w:val="56"/>
           <w:szCs w:val="56"/>
         </w:rPr>
-        <w:t>Nessa aula, vamos aprender como criar estruturas condicionais aninhadas, usando os comandos if.. elif.. else em programas Python.</w:t>
+        <w:t xml:space="preserve">Nessa aula, vamos aprender como criar estruturas condicionais aninhadas, usando os comandos </w:t>
+      </w:r>
+      <w:proofErr w:type="spellStart"/>
+      <w:r>
+        <w:rPr>
+          <w:rFonts w:ascii="Arial" w:hAnsi="Arial" w:cs="Arial"/>
+          <w:sz w:val="56"/>
+          <w:szCs w:val="56"/>
+        </w:rPr>
+        <w:t>if</w:t>
+      </w:r>
+      <w:proofErr w:type="spellEnd"/>
+      <w:r>
+        <w:rPr>
+          <w:rFonts w:ascii="Arial" w:hAnsi="Arial" w:cs="Arial"/>
+          <w:sz w:val="56"/>
+          <w:szCs w:val="56"/>
+        </w:rPr>
+        <w:t xml:space="preserve">.. </w:t>
+      </w:r>
+      <w:proofErr w:type="spellStart"/>
+      <w:r>
+        <w:rPr>
+          <w:rFonts w:ascii="Arial" w:hAnsi="Arial" w:cs="Arial"/>
+          <w:sz w:val="56"/>
+          <w:szCs w:val="56"/>
+        </w:rPr>
+        <w:t>elif</w:t>
+      </w:r>
+      <w:proofErr w:type="spellEnd"/>
+      <w:r>
+        <w:rPr>
+          <w:rFonts w:ascii="Arial" w:hAnsi="Arial" w:cs="Arial"/>
+          <w:sz w:val="56"/>
+          <w:szCs w:val="56"/>
+        </w:rPr>
+        <w:t xml:space="preserve">.. </w:t>
+      </w:r>
+      <w:proofErr w:type="spellStart"/>
+      <w:r>
+        <w:rPr>
+          <w:rFonts w:ascii="Arial" w:hAnsi="Arial" w:cs="Arial"/>
+          <w:sz w:val="56"/>
+          <w:szCs w:val="56"/>
+        </w:rPr>
+        <w:t>else</w:t>
+      </w:r>
+      <w:proofErr w:type="spellEnd"/>
+      <w:r>
+        <w:rPr>
+          <w:rFonts w:ascii="Arial" w:hAnsi="Arial" w:cs="Arial"/>
+          <w:sz w:val="56"/>
+          <w:szCs w:val="56"/>
+        </w:rPr>
+        <w:t xml:space="preserve"> em programas Python.</w:t>
       </w:r>
     </w:p>
     <w:p>
@@ -278,34 +404,7 @@
           <w:szCs w:val="56"/>
           <w:highlight w:val="yellow"/>
         </w:rPr>
-        <w:t>Aula 1</w:t>
-      </w:r>
-      <w:r>
-        <w:rPr>
-          <w:rFonts w:ascii="Arial" w:hAnsi="Arial" w:cs="Arial"/>
-          <w:sz w:val="56"/>
-          <w:szCs w:val="56"/>
-          <w:highlight w:val="yellow"/>
-        </w:rPr>
-        <w:t>3</w:t>
-      </w:r>
-      <w:r>
-        <w:rPr>
-          <w:rFonts w:ascii="Arial" w:hAnsi="Arial" w:cs="Arial"/>
-          <w:sz w:val="56"/>
-          <w:szCs w:val="56"/>
-          <w:highlight w:val="yellow"/>
-        </w:rPr>
-        <w:t xml:space="preserve"> </w:t>
-      </w:r>
-      <w:r>
-        <w:rPr>
-          <w:rFonts w:ascii="Arial" w:hAnsi="Arial" w:cs="Arial"/>
-          <w:sz w:val="56"/>
-          <w:szCs w:val="56"/>
-          <w:highlight w:val="yellow"/>
-        </w:rPr>
-        <w:t>Estrutura de repetição for</w:t>
+        <w:t>Aula 13 Estrutura de repetição for</w:t>
       </w:r>
     </w:p>
     <w:p>
@@ -1046,6 +1145,590 @@
           </wp:inline>
         </w:drawing>
       </w:r>
+    </w:p>
+    <w:p>
+      <w:pPr>
+        <w:rPr>
+          <w:rFonts w:ascii="Arial" w:hAnsi="Arial" w:cs="Arial"/>
+          <w:sz w:val="56"/>
+          <w:szCs w:val="56"/>
+        </w:rPr>
+      </w:pPr>
+    </w:p>
+    <w:p>
+      <w:pPr>
+        <w:rPr>
+          <w:rFonts w:ascii="Arial" w:hAnsi="Arial" w:cs="Arial"/>
+          <w:sz w:val="56"/>
+          <w:szCs w:val="56"/>
+        </w:rPr>
+      </w:pPr>
+      <w:proofErr w:type="spellStart"/>
+      <w:r>
+        <w:rPr>
+          <w:rFonts w:ascii="Arial" w:hAnsi="Arial" w:cs="Arial"/>
+          <w:sz w:val="56"/>
+          <w:szCs w:val="56"/>
+          <w:highlight w:val="yellow"/>
+        </w:rPr>
+        <w:t>Exercicio</w:t>
+      </w:r>
+      <w:proofErr w:type="spellEnd"/>
+      <w:r>
+        <w:rPr>
+          <w:rFonts w:ascii="Arial" w:hAnsi="Arial" w:cs="Arial"/>
+          <w:sz w:val="56"/>
+          <w:szCs w:val="56"/>
+          <w:highlight w:val="yellow"/>
+        </w:rPr>
+        <w:t xml:space="preserve"> de Python</w:t>
+      </w:r>
+      <w:r>
+        <w:rPr>
+          <w:rFonts w:ascii="Arial" w:hAnsi="Arial" w:cs="Arial"/>
+          <w:sz w:val="56"/>
+          <w:szCs w:val="56"/>
+          <w:highlight w:val="yellow"/>
+        </w:rPr>
+        <w:t xml:space="preserve"> </w:t>
+      </w:r>
+      <w:r>
+        <w:rPr>
+          <w:rFonts w:ascii="Arial" w:hAnsi="Arial" w:cs="Arial"/>
+          <w:sz w:val="56"/>
+          <w:szCs w:val="56"/>
+          <w:highlight w:val="yellow"/>
+        </w:rPr>
+        <w:t>047</w:t>
+      </w:r>
+      <w:r>
+        <w:rPr>
+          <w:rFonts w:ascii="Arial" w:hAnsi="Arial" w:cs="Arial"/>
+          <w:sz w:val="56"/>
+          <w:szCs w:val="56"/>
+          <w:highlight w:val="yellow"/>
+        </w:rPr>
+        <w:t xml:space="preserve"> Repetições </w:t>
+      </w:r>
+      <w:r>
+        <w:rPr>
+          <w:rFonts w:ascii="Arial" w:hAnsi="Arial" w:cs="Arial"/>
+          <w:sz w:val="56"/>
+          <w:szCs w:val="56"/>
+          <w:highlight w:val="yellow"/>
+        </w:rPr>
+        <w:t>“</w:t>
+      </w:r>
+      <w:r>
+        <w:rPr>
+          <w:rFonts w:ascii="Arial" w:hAnsi="Arial" w:cs="Arial"/>
+          <w:sz w:val="56"/>
+          <w:szCs w:val="56"/>
+          <w:highlight w:val="yellow"/>
+        </w:rPr>
+        <w:t>for “</w:t>
+      </w:r>
+    </w:p>
+    <w:p>
+      <w:pPr>
+        <w:rPr>
+          <w:rFonts w:ascii="Arial" w:hAnsi="Arial" w:cs="Arial"/>
+          <w:sz w:val="56"/>
+          <w:szCs w:val="56"/>
+        </w:rPr>
+      </w:pPr>
+      <w:r>
+        <w:rPr>
+          <w:noProof/>
+        </w:rPr>
+        <w:drawing>
+          <wp:inline distT="0" distB="0" distL="0" distR="0" wp14:anchorId="2D0702ED" wp14:editId="0107F639">
+            <wp:extent cx="13011150" cy="7315200"/>
+            <wp:effectExtent l="0" t="0" r="0" b="0"/>
+            <wp:docPr id="18" name="Imagem 18"/>
+            <wp:cNvGraphicFramePr>
+              <a:graphicFrameLocks xmlns:a="http://schemas.openxmlformats.org/drawingml/2006/main" noChangeAspect="1"/>
+            </wp:cNvGraphicFramePr>
+            <a:graphic xmlns:a="http://schemas.openxmlformats.org/drawingml/2006/main">
+              <a:graphicData uri="http://schemas.openxmlformats.org/drawingml/2006/picture">
+                <pic:pic xmlns:pic="http://schemas.openxmlformats.org/drawingml/2006/picture">
+                  <pic:nvPicPr>
+                    <pic:cNvPr id="1" name=""/>
+                    <pic:cNvPicPr/>
+                  </pic:nvPicPr>
+                  <pic:blipFill>
+                    <a:blip r:embed="rId22"/>
+                    <a:stretch>
+                      <a:fillRect/>
+                    </a:stretch>
+                  </pic:blipFill>
+                  <pic:spPr>
+                    <a:xfrm>
+                      <a:off x="0" y="0"/>
+                      <a:ext cx="13011150" cy="7315200"/>
+                    </a:xfrm>
+                    <a:prstGeom prst="rect">
+                      <a:avLst/>
+                    </a:prstGeom>
+                  </pic:spPr>
+                </pic:pic>
+              </a:graphicData>
+            </a:graphic>
+          </wp:inline>
+        </w:drawing>
+      </w:r>
+    </w:p>
+    <w:p>
+      <w:pPr>
+        <w:rPr>
+          <w:rFonts w:ascii="Arial" w:hAnsi="Arial" w:cs="Arial"/>
+          <w:sz w:val="56"/>
+          <w:szCs w:val="56"/>
+          <w:highlight w:val="yellow"/>
+        </w:rPr>
+      </w:pPr>
+    </w:p>
+    <w:p>
+      <w:pPr>
+        <w:rPr>
+          <w:rFonts w:ascii="Arial" w:hAnsi="Arial" w:cs="Arial"/>
+          <w:sz w:val="56"/>
+          <w:szCs w:val="56"/>
+        </w:rPr>
+      </w:pPr>
+      <w:proofErr w:type="spellStart"/>
+      <w:r>
+        <w:rPr>
+          <w:rFonts w:ascii="Arial" w:hAnsi="Arial" w:cs="Arial"/>
+          <w:sz w:val="56"/>
+          <w:szCs w:val="56"/>
+          <w:highlight w:val="yellow"/>
+        </w:rPr>
+        <w:t>Exercicio</w:t>
+      </w:r>
+      <w:proofErr w:type="spellEnd"/>
+      <w:r>
+        <w:rPr>
+          <w:rFonts w:ascii="Arial" w:hAnsi="Arial" w:cs="Arial"/>
+          <w:sz w:val="56"/>
+          <w:szCs w:val="56"/>
+          <w:highlight w:val="yellow"/>
+        </w:rPr>
+        <w:t xml:space="preserve"> de Python</w:t>
+      </w:r>
+      <w:r>
+        <w:rPr>
+          <w:rFonts w:ascii="Arial" w:hAnsi="Arial" w:cs="Arial"/>
+          <w:sz w:val="56"/>
+          <w:szCs w:val="56"/>
+          <w:highlight w:val="yellow"/>
+        </w:rPr>
+        <w:t xml:space="preserve"> </w:t>
+      </w:r>
+      <w:r>
+        <w:rPr>
+          <w:rFonts w:ascii="Arial" w:hAnsi="Arial" w:cs="Arial"/>
+          <w:sz w:val="56"/>
+          <w:szCs w:val="56"/>
+          <w:highlight w:val="yellow"/>
+        </w:rPr>
+        <w:t>047</w:t>
+      </w:r>
+      <w:r>
+        <w:rPr>
+          <w:rFonts w:ascii="Arial" w:hAnsi="Arial" w:cs="Arial"/>
+          <w:sz w:val="56"/>
+          <w:szCs w:val="56"/>
+          <w:highlight w:val="yellow"/>
+        </w:rPr>
+        <w:t xml:space="preserve"> versa0 02-</w:t>
+      </w:r>
+      <w:r>
+        <w:rPr>
+          <w:rFonts w:ascii="Arial" w:hAnsi="Arial" w:cs="Arial"/>
+          <w:sz w:val="56"/>
+          <w:szCs w:val="56"/>
+          <w:highlight w:val="yellow"/>
+        </w:rPr>
+        <w:t xml:space="preserve"> Repetições </w:t>
+      </w:r>
+      <w:r>
+        <w:rPr>
+          <w:rFonts w:ascii="Arial" w:hAnsi="Arial" w:cs="Arial"/>
+          <w:sz w:val="56"/>
+          <w:szCs w:val="56"/>
+          <w:highlight w:val="yellow"/>
+        </w:rPr>
+        <w:t>“</w:t>
+      </w:r>
+      <w:r>
+        <w:rPr>
+          <w:rFonts w:ascii="Arial" w:hAnsi="Arial" w:cs="Arial"/>
+          <w:sz w:val="56"/>
+          <w:szCs w:val="56"/>
+          <w:highlight w:val="yellow"/>
+        </w:rPr>
+        <w:t>for “</w:t>
+      </w:r>
+    </w:p>
+    <w:p>
+      <w:pPr>
+        <w:rPr>
+          <w:rFonts w:ascii="Arial" w:hAnsi="Arial" w:cs="Arial"/>
+          <w:sz w:val="56"/>
+          <w:szCs w:val="56"/>
+        </w:rPr>
+      </w:pPr>
+      <w:r>
+        <w:rPr>
+          <w:noProof/>
+        </w:rPr>
+        <w:drawing>
+          <wp:inline distT="0" distB="0" distL="0" distR="0" wp14:anchorId="333C2C04" wp14:editId="26716EFF">
+            <wp:extent cx="13011150" cy="7315200"/>
+            <wp:effectExtent l="0" t="0" r="0" b="0"/>
+            <wp:docPr id="19" name="Imagem 19"/>
+            <wp:cNvGraphicFramePr>
+              <a:graphicFrameLocks xmlns:a="http://schemas.openxmlformats.org/drawingml/2006/main" noChangeAspect="1"/>
+            </wp:cNvGraphicFramePr>
+            <a:graphic xmlns:a="http://schemas.openxmlformats.org/drawingml/2006/main">
+              <a:graphicData uri="http://schemas.openxmlformats.org/drawingml/2006/picture">
+                <pic:pic xmlns:pic="http://schemas.openxmlformats.org/drawingml/2006/picture">
+                  <pic:nvPicPr>
+                    <pic:cNvPr id="1" name=""/>
+                    <pic:cNvPicPr/>
+                  </pic:nvPicPr>
+                  <pic:blipFill>
+                    <a:blip r:embed="rId23"/>
+                    <a:stretch>
+                      <a:fillRect/>
+                    </a:stretch>
+                  </pic:blipFill>
+                  <pic:spPr>
+                    <a:xfrm>
+                      <a:off x="0" y="0"/>
+                      <a:ext cx="13011150" cy="7315200"/>
+                    </a:xfrm>
+                    <a:prstGeom prst="rect">
+                      <a:avLst/>
+                    </a:prstGeom>
+                  </pic:spPr>
+                </pic:pic>
+              </a:graphicData>
+            </a:graphic>
+          </wp:inline>
+        </w:drawing>
+      </w:r>
+    </w:p>
+    <w:p>
+      <w:pPr>
+        <w:rPr>
+          <w:rFonts w:ascii="Arial" w:hAnsi="Arial" w:cs="Arial"/>
+          <w:sz w:val="56"/>
+          <w:szCs w:val="56"/>
+          <w:highlight w:val="yellow"/>
+        </w:rPr>
+      </w:pPr>
+    </w:p>
+    <w:p>
+      <w:pPr>
+        <w:rPr>
+          <w:rFonts w:ascii="Arial" w:hAnsi="Arial" w:cs="Arial"/>
+          <w:sz w:val="56"/>
+          <w:szCs w:val="56"/>
+        </w:rPr>
+      </w:pPr>
+      <w:proofErr w:type="spellStart"/>
+      <w:r>
+        <w:rPr>
+          <w:rFonts w:ascii="Arial" w:hAnsi="Arial" w:cs="Arial"/>
+          <w:sz w:val="56"/>
+          <w:szCs w:val="56"/>
+          <w:highlight w:val="yellow"/>
+        </w:rPr>
+        <w:t>Exercicio</w:t>
+      </w:r>
+      <w:proofErr w:type="spellEnd"/>
+      <w:r>
+        <w:rPr>
+          <w:rFonts w:ascii="Arial" w:hAnsi="Arial" w:cs="Arial"/>
+          <w:sz w:val="56"/>
+          <w:szCs w:val="56"/>
+          <w:highlight w:val="yellow"/>
+        </w:rPr>
+        <w:t xml:space="preserve"> de Python</w:t>
+      </w:r>
+      <w:r>
+        <w:rPr>
+          <w:rFonts w:ascii="Arial" w:hAnsi="Arial" w:cs="Arial"/>
+          <w:sz w:val="56"/>
+          <w:szCs w:val="56"/>
+          <w:highlight w:val="yellow"/>
+        </w:rPr>
+        <w:t xml:space="preserve"> </w:t>
+      </w:r>
+      <w:r>
+        <w:rPr>
+          <w:rFonts w:ascii="Arial" w:hAnsi="Arial" w:cs="Arial"/>
+          <w:sz w:val="56"/>
+          <w:szCs w:val="56"/>
+          <w:highlight w:val="yellow"/>
+        </w:rPr>
+        <w:t>04</w:t>
+      </w:r>
+      <w:r>
+        <w:rPr>
+          <w:rFonts w:ascii="Arial" w:hAnsi="Arial" w:cs="Arial"/>
+          <w:sz w:val="56"/>
+          <w:szCs w:val="56"/>
+          <w:highlight w:val="yellow"/>
+        </w:rPr>
+        <w:t>8</w:t>
+      </w:r>
+      <w:r>
+        <w:rPr>
+          <w:rFonts w:ascii="Arial" w:hAnsi="Arial" w:cs="Arial"/>
+          <w:sz w:val="56"/>
+          <w:szCs w:val="56"/>
+          <w:highlight w:val="yellow"/>
+        </w:rPr>
+        <w:t xml:space="preserve"> </w:t>
+      </w:r>
+      <w:r>
+        <w:rPr>
+          <w:rFonts w:ascii="Arial" w:hAnsi="Arial" w:cs="Arial"/>
+          <w:sz w:val="56"/>
+          <w:szCs w:val="56"/>
+          <w:highlight w:val="yellow"/>
+        </w:rPr>
+        <w:t xml:space="preserve"> Repetições </w:t>
+      </w:r>
+      <w:r>
+        <w:rPr>
+          <w:rFonts w:ascii="Arial" w:hAnsi="Arial" w:cs="Arial"/>
+          <w:sz w:val="56"/>
+          <w:szCs w:val="56"/>
+          <w:highlight w:val="yellow"/>
+        </w:rPr>
+        <w:t>“</w:t>
+      </w:r>
+      <w:r>
+        <w:rPr>
+          <w:rFonts w:ascii="Arial" w:hAnsi="Arial" w:cs="Arial"/>
+          <w:sz w:val="56"/>
+          <w:szCs w:val="56"/>
+          <w:highlight w:val="yellow"/>
+        </w:rPr>
+        <w:t>for “</w:t>
+      </w:r>
+    </w:p>
+    <w:p>
+      <w:pPr>
+        <w:rPr>
+          <w:rFonts w:ascii="Arial" w:hAnsi="Arial" w:cs="Arial"/>
+          <w:sz w:val="56"/>
+          <w:szCs w:val="56"/>
+        </w:rPr>
+      </w:pPr>
+      <w:r>
+        <w:rPr>
+          <w:noProof/>
+        </w:rPr>
+        <w:drawing>
+          <wp:inline distT="0" distB="0" distL="0" distR="0" wp14:anchorId="1A1631CF" wp14:editId="608190C3">
+            <wp:extent cx="13011150" cy="7315200"/>
+            <wp:effectExtent l="0" t="0" r="0" b="0"/>
+            <wp:docPr id="20" name="Imagem 20"/>
+            <wp:cNvGraphicFramePr>
+              <a:graphicFrameLocks xmlns:a="http://schemas.openxmlformats.org/drawingml/2006/main" noChangeAspect="1"/>
+            </wp:cNvGraphicFramePr>
+            <a:graphic xmlns:a="http://schemas.openxmlformats.org/drawingml/2006/main">
+              <a:graphicData uri="http://schemas.openxmlformats.org/drawingml/2006/picture">
+                <pic:pic xmlns:pic="http://schemas.openxmlformats.org/drawingml/2006/picture">
+                  <pic:nvPicPr>
+                    <pic:cNvPr id="1" name=""/>
+                    <pic:cNvPicPr/>
+                  </pic:nvPicPr>
+                  <pic:blipFill>
+                    <a:blip r:embed="rId24"/>
+                    <a:stretch>
+                      <a:fillRect/>
+                    </a:stretch>
+                  </pic:blipFill>
+                  <pic:spPr>
+                    <a:xfrm>
+                      <a:off x="0" y="0"/>
+                      <a:ext cx="13011150" cy="7315200"/>
+                    </a:xfrm>
+                    <a:prstGeom prst="rect">
+                      <a:avLst/>
+                    </a:prstGeom>
+                  </pic:spPr>
+                </pic:pic>
+              </a:graphicData>
+            </a:graphic>
+          </wp:inline>
+        </w:drawing>
+      </w:r>
+    </w:p>
+    <w:p>
+      <w:pPr>
+        <w:rPr>
+          <w:rFonts w:ascii="Arial" w:hAnsi="Arial" w:cs="Arial"/>
+          <w:sz w:val="56"/>
+          <w:szCs w:val="56"/>
+        </w:rPr>
+      </w:pPr>
+    </w:p>
+    <w:p>
+      <w:pPr>
+        <w:rPr>
+          <w:rFonts w:ascii="Arial" w:hAnsi="Arial" w:cs="Arial"/>
+          <w:sz w:val="56"/>
+          <w:szCs w:val="56"/>
+        </w:rPr>
+      </w:pPr>
+      <w:proofErr w:type="spellStart"/>
+      <w:r>
+        <w:rPr>
+          <w:rFonts w:ascii="Arial" w:hAnsi="Arial" w:cs="Arial"/>
+          <w:sz w:val="56"/>
+          <w:szCs w:val="56"/>
+          <w:highlight w:val="yellow"/>
+        </w:rPr>
+        <w:t>Exercicio</w:t>
+      </w:r>
+      <w:proofErr w:type="spellEnd"/>
+      <w:r>
+        <w:rPr>
+          <w:rFonts w:ascii="Arial" w:hAnsi="Arial" w:cs="Arial"/>
+          <w:sz w:val="56"/>
+          <w:szCs w:val="56"/>
+          <w:highlight w:val="yellow"/>
+        </w:rPr>
+        <w:t xml:space="preserve"> de Python</w:t>
+      </w:r>
+      <w:r>
+        <w:rPr>
+          <w:rFonts w:ascii="Arial" w:hAnsi="Arial" w:cs="Arial"/>
+          <w:sz w:val="56"/>
+          <w:szCs w:val="56"/>
+          <w:highlight w:val="yellow"/>
+        </w:rPr>
+        <w:t xml:space="preserve"> </w:t>
+      </w:r>
+      <w:r>
+        <w:rPr>
+          <w:rFonts w:ascii="Arial" w:hAnsi="Arial" w:cs="Arial"/>
+          <w:sz w:val="56"/>
+          <w:szCs w:val="56"/>
+          <w:highlight w:val="yellow"/>
+        </w:rPr>
+        <w:t>04</w:t>
+      </w:r>
+      <w:r>
+        <w:rPr>
+          <w:rFonts w:ascii="Arial" w:hAnsi="Arial" w:cs="Arial"/>
+          <w:sz w:val="56"/>
+          <w:szCs w:val="56"/>
+          <w:highlight w:val="yellow"/>
+        </w:rPr>
+        <w:t>9</w:t>
+      </w:r>
+      <w:r>
+        <w:rPr>
+          <w:rFonts w:ascii="Arial" w:hAnsi="Arial" w:cs="Arial"/>
+          <w:sz w:val="56"/>
+          <w:szCs w:val="56"/>
+          <w:highlight w:val="yellow"/>
+        </w:rPr>
+        <w:t xml:space="preserve"> </w:t>
+      </w:r>
+      <w:r>
+        <w:rPr>
+          <w:rFonts w:ascii="Arial" w:hAnsi="Arial" w:cs="Arial"/>
+          <w:sz w:val="56"/>
+          <w:szCs w:val="56"/>
+          <w:highlight w:val="yellow"/>
+        </w:rPr>
+        <w:t xml:space="preserve"> Repetições </w:t>
+      </w:r>
+      <w:r>
+        <w:rPr>
+          <w:rFonts w:ascii="Arial" w:hAnsi="Arial" w:cs="Arial"/>
+          <w:sz w:val="56"/>
+          <w:szCs w:val="56"/>
+          <w:highlight w:val="yellow"/>
+        </w:rPr>
+        <w:t>“</w:t>
+      </w:r>
+      <w:r>
+        <w:rPr>
+          <w:rFonts w:ascii="Arial" w:hAnsi="Arial" w:cs="Arial"/>
+          <w:sz w:val="56"/>
+          <w:szCs w:val="56"/>
+          <w:highlight w:val="yellow"/>
+        </w:rPr>
+        <w:t>for “</w:t>
+      </w:r>
+    </w:p>
+    <w:p>
+      <w:pPr>
+        <w:rPr>
+          <w:rFonts w:ascii="Arial" w:hAnsi="Arial" w:cs="Arial"/>
+          <w:sz w:val="56"/>
+          <w:szCs w:val="56"/>
+        </w:rPr>
+      </w:pPr>
+      <w:r>
+        <w:rPr>
+          <w:noProof/>
+        </w:rPr>
+        <w:drawing>
+          <wp:inline distT="0" distB="0" distL="0" distR="0" wp14:anchorId="03B00139" wp14:editId="122B9DA9">
+            <wp:extent cx="13011150" cy="7315200"/>
+            <wp:effectExtent l="0" t="0" r="0" b="0"/>
+            <wp:docPr id="21" name="Imagem 21"/>
+            <wp:cNvGraphicFramePr>
+              <a:graphicFrameLocks xmlns:a="http://schemas.openxmlformats.org/drawingml/2006/main" noChangeAspect="1"/>
+            </wp:cNvGraphicFramePr>
+            <a:graphic xmlns:a="http://schemas.openxmlformats.org/drawingml/2006/main">
+              <a:graphicData uri="http://schemas.openxmlformats.org/drawingml/2006/picture">
+                <pic:pic xmlns:pic="http://schemas.openxmlformats.org/drawingml/2006/picture">
+                  <pic:nvPicPr>
+                    <pic:cNvPr id="1" name=""/>
+                    <pic:cNvPicPr/>
+                  </pic:nvPicPr>
+                  <pic:blipFill>
+                    <a:blip r:embed="rId25"/>
+                    <a:stretch>
+                      <a:fillRect/>
+                    </a:stretch>
+                  </pic:blipFill>
+                  <pic:spPr>
+                    <a:xfrm>
+                      <a:off x="0" y="0"/>
+                      <a:ext cx="13011150" cy="7315200"/>
+                    </a:xfrm>
+                    <a:prstGeom prst="rect">
+                      <a:avLst/>
+                    </a:prstGeom>
+                  </pic:spPr>
+                </pic:pic>
+              </a:graphicData>
+            </a:graphic>
+          </wp:inline>
+        </w:drawing>
+      </w:r>
+    </w:p>
+    <w:p>
+      <w:pPr>
+        <w:rPr>
+          <w:rFonts w:ascii="Arial" w:hAnsi="Arial" w:cs="Arial"/>
+          <w:sz w:val="56"/>
+          <w:szCs w:val="56"/>
+        </w:rPr>
+      </w:pPr>
     </w:p>
     <w:p>
       <w:pPr>
@@ -1722,6 +2405,7 @@
   <w:style w:type="character" w:default="1" w:styleId="Fontepargpadro">
     <w:name w:val="Default Paragraph Font"/>
     <w:uiPriority w:val="1"/>
+    <w:semiHidden/>
     <w:unhideWhenUsed/>
   </w:style>
   <w:style w:type="table" w:default="1" w:styleId="Tabelanormal">

</xml_diff>